<commit_message>
Untrack Office lock file and ignore ~$* temp files
</commit_message>
<xml_diff>
--- a/docs/IEEE-LRA-Word-template.docx
+++ b/docs/IEEE-LRA-Word-template.docx
@@ -2131,7 +2131,7 @@
           <w:noProof/>
         </w:rPr>
         <w:drawing>
-          <wp:inline distT="0" distB="0" distL="0" distR="0" wp14:anchorId="02982399" wp14:editId="3CE07BB1">
+          <wp:inline distT="0" distB="0" distL="0" distR="0" wp14:anchorId="02982399" wp14:editId="157A895A">
             <wp:extent cx="3063240" cy="1956714"/>
             <wp:effectExtent l="0" t="0" r="3810" b="5715"/>
             <wp:docPr id="13" name="Picture 13" descr="Z:\Indesign Projects\005 Series\03 OA Word templates\Work\TJ\Work\Fig3.tif"/>
@@ -3082,10 +3082,10 @@
             <v:path o:extrusionok="f" gradientshapeok="t" o:connecttype="rect"/>
             <o:lock v:ext="edit" aspectratio="t"/>
           </v:shapetype>
-          <v:shape id="_x0000_i1025" type="#_x0000_t75" alt="" style="width:6.35pt;height:6.35pt;mso-width-percent:0;mso-height-percent:0;mso-width-percent:0;mso-height-percent:0" o:ole="" fillcolor="window">
+          <v:shape id="_x0000_i1025" type="#_x0000_t75" alt="" style="width:6.6pt;height:6.6pt;mso-width-percent:0;mso-height-percent:0;mso-width-percent:0;mso-height-percent:0" o:ole="" fillcolor="window">
             <v:imagedata r:id="rId23" o:title=""/>
           </v:shape>
-          <o:OLEObject Type="Embed" ProgID="Equation.3" ShapeID="_x0000_i1025" DrawAspect="Content" ObjectID="_1843217642" r:id="rId24"/>
+          <o:OLEObject Type="Embed" ProgID="Equation.3" ShapeID="_x0000_i1025" DrawAspect="Content" ObjectID="_1844085795" r:id="rId24"/>
         </w:object>
       </w:r>
       <w:r>
@@ -9650,16 +9650,24 @@
 </file>
 
 <file path=customXml/item1.xml><?xml version="1.0" encoding="utf-8"?>
+<b:Sources xmlns:b="http://schemas.openxmlformats.org/officeDocument/2006/bibliography" xmlns="http://schemas.openxmlformats.org/officeDocument/2006/bibliography" SelectedStyle="\APASixthEditionOfficeOnline.xsl" StyleName="APA" Version="6"/>
+</file>
+
+<file path=customXml/item2.xml><?xml version="1.0" encoding="utf-8"?>
 <go:gDocsCustomXmlDataStorage xmlns:go="http://customooxmlschemas.google.com/" xmlns:r="http://schemas.openxmlformats.org/officeDocument/2006/relationships">
   <go:docsCustomData xmlns:go="http://customooxmlschemas.google.com/" roundtripDataSignature="AMtx7mjPovk3igAzhESNbNe8yh+DWI7/jA==">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</go:docsCustomData>
 </go:gDocsCustomXmlDataStorage>
 </file>
 
-<file path=customXml/item2.xml><?xml version="1.0" encoding="utf-8"?>
-<b:Sources xmlns:b="http://schemas.openxmlformats.org/officeDocument/2006/bibliography" xmlns="http://schemas.openxmlformats.org/officeDocument/2006/bibliography" SelectedStyle="\APASixthEditionOfficeOnline.xsl" StyleName="APA" Version="6"/>
+<file path=customXml/itemProps1.xml><?xml version="1.0" encoding="utf-8"?>
+<ds:datastoreItem xmlns:ds="http://schemas.openxmlformats.org/officeDocument/2006/customXml" ds:itemID="{7FDB3116-7FC6-4074-8BFD-613BFCEE0C0E}">
+  <ds:schemaRefs>
+    <ds:schemaRef ds:uri="http://schemas.openxmlformats.org/officeDocument/2006/bibliography"/>
+  </ds:schemaRefs>
+</ds:datastoreItem>
 </file>
 
-<file path=customXml/itemProps1.xml><?xml version="1.0" encoding="utf-8"?>
+<file path=customXml/itemProps2.xml><?xml version="1.0" encoding="utf-8"?>
 <ds:datastoreItem xmlns:ds="http://schemas.openxmlformats.org/officeDocument/2006/customXml" ds:itemID="{11111111-1234-1234-1234-123412341234}">
   <ds:schemaRefs>
     <ds:schemaRef ds:uri="http://customooxmlschemas.google.com/"/>
@@ -9668,10 +9676,8 @@
 </ds:datastoreItem>
 </file>
 
-<file path=customXml/itemProps2.xml><?xml version="1.0" encoding="utf-8"?>
-<ds:datastoreItem xmlns:ds="http://schemas.openxmlformats.org/officeDocument/2006/customXml" ds:itemID="{7FDB3116-7FC6-4074-8BFD-613BFCEE0C0E}">
-  <ds:schemaRefs>
-    <ds:schemaRef ds:uri="http://schemas.openxmlformats.org/officeDocument/2006/bibliography"/>
-  </ds:schemaRefs>
-</ds:datastoreItem>
+<file path=docMetadata/LabelInfo.xml><?xml version="1.0" encoding="utf-8"?>
+<clbl:labelList xmlns:clbl="http://schemas.microsoft.com/office/2020/mipLabelMetadata">
+  <clbl:label id="{77faecb0-01ff-4510-9e2c-33c71b96be3f}" enabled="1" method="Privileged" siteId="{c599973b-ed40-4b93-a663-2eb366f8aa10}" contentBits="0" removed="0"/>
+</clbl:labelList>
 </file>
</xml_diff>